<commit_message>
Meetings 5 & 7: bring the right artifact at the right time
- M5 pre-work no longer asks teams to bring student work samples and assessment
  examples (not used until M9/M13). It now asks for the standard + curriculum —
  the raw material actually used to deconstruct it at M6.
- M7 'look at sample work' step reframed to 'pressure-test your criteria' by
  sketching a proficient response, since no student work exists yet; the full
  anchor comparison lives at M8. Regenerated both agenda one-pagers.

Co-Authored-By: Claude Opus 4.8 <noreply@anthropic.com>
</commit_message>
<xml_diff>
--- a/public/agendas/ems-meeting-5-agenda.docx
+++ b/public/agendas/ems-meeting-5-agenda.docx
@@ -4,13 +4,12 @@
   <w:body>
     <w:p>
       <w:pPr>
-        <w:spacing w:after="30"/>
-        <w:jc w:val="center"/>
+        <w:spacing w:after="40"/>
       </w:pPr>
       <w:r>
         <w:drawing>
           <wp:inline distT="0" distB="0" distL="0" distR="0">
-            <wp:extent cx="571500" cy="371475"/>
+            <wp:extent cx="438150" cy="438150"/>
             <wp:effectExtent t="0" r="0" b="0" l="0"/>
             <wp:docPr id="1" name="" descr="" title=""/>
             <wp:cNvGraphicFramePr>
@@ -35,7 +34,7 @@
                   <pic:spPr bwMode="auto">
                     <a:xfrm>
                       <a:off x="0" y="0"/>
-                      <a:ext cx="571500" cy="371475"/>
+                      <a:ext cx="438150" cy="438150"/>
                     </a:xfrm>
                     <a:prstGeom prst="rect">
                       <a:avLst/>
@@ -50,8 +49,7 @@
     </w:p>
     <w:p>
       <w:pPr>
-        <w:spacing w:after="30"/>
-        <w:jc w:val="center"/>
+        <w:spacing w:after="20"/>
       </w:pPr>
       <w:r>
         <w:rPr>
@@ -59,8 +57,9 @@
           <w:b/>
           <w:bCs/>
           <w:color w:val="9B2C2C"/>
-          <w:sz w:val="15"/>
-          <w:szCs w:val="15"/>
+          <w:spacing w:val="8"/>
+          <w:sz w:val="16"/>
+          <w:szCs w:val="16"/>
         </w:rPr>
         <w:t xml:space="preserve">ELSINORE MIDDLE SCHOOL · MEETING 5 OF 18 · AGENDA</w:t>
       </w:r>
@@ -68,7 +67,6 @@
     <w:p>
       <w:pPr>
         <w:spacing w:after="20"/>
-        <w:jc w:val="center"/>
       </w:pPr>
       <w:r>
         <w:rPr>
@@ -84,24 +82,25 @@
     </w:p>
     <w:p>
       <w:pPr>
-        <w:spacing w:after="170"/>
-        <w:jc w:val="center"/>
+        <w:pBdr>
+          <w:bottom w:val="single" w:color="9B2C2C" w:sz="14" w:space="6"/>
+        </w:pBdr>
+        <w:spacing w:after="120"/>
       </w:pPr>
       <w:r>
         <w:rPr>
           <w:rFonts w:ascii="Calibri" w:cs="Calibri" w:eastAsia="Calibri" w:hAnsi="Calibri"/>
-          <w:i/>
-          <w:iCs/>
           <w:color w:val="64748B"/>
-          <w:sz w:val="23"/>
-          <w:szCs w:val="23"/>
+          <w:sz w:val="22"/>
+          <w:szCs w:val="22"/>
         </w:rPr>
         <w:t xml:space="preserve">PLC Question 1: What do we want students to learn?</w:t>
       </w:r>
     </w:p>
     <w:p>
       <w:pPr>
-        <w:spacing w:after="90" w:before="220"/>
+        <w:keepNext/>
+        <w:spacing w:after="80" w:before="200"/>
       </w:pPr>
       <w:r>
         <w:rPr>
@@ -109,15 +108,15 @@
           <w:b/>
           <w:bCs/>
           <w:color w:val="9B2C2C"/>
-          <w:sz w:val="26"/>
-          <w:szCs w:val="26"/>
+          <w:sz w:val="25"/>
+          <w:szCs w:val="25"/>
         </w:rPr>
         <w:t xml:space="preserve">Why this meeting matters</w:t>
       </w:r>
     </w:p>
     <w:p>
       <w:pPr>
-        <w:spacing w:after="90"/>
+        <w:spacing w:after="120"/>
       </w:pPr>
       <w:r>
         <w:rPr>
@@ -133,17 +132,17 @@
       <w:tblPr>
         <w:tblW w:type="dxa" w:w="9360"/>
         <w:tblBorders>
-          <w:top w:val="single" w:color="auto" w:sz="4"/>
-          <w:left w:val="single" w:color="auto" w:sz="4"/>
-          <w:bottom w:val="single" w:color="auto" w:sz="4"/>
-          <w:right w:val="single" w:color="auto" w:sz="4"/>
-          <w:insideH w:val="single" w:color="auto" w:sz="4"/>
-          <w:insideV w:val="single" w:color="auto" w:sz="4"/>
+          <w:top w:val="single" w:color="E5E7EB" w:sz="4"/>
+          <w:left w:val="single" w:color="E5E7EB" w:sz="4"/>
+          <w:bottom w:val="single" w:color="E5E7EB" w:sz="4"/>
+          <w:right w:val="single" w:color="E5E7EB" w:sz="4"/>
+          <w:insideH w:val="single" w:color="E5E7EB" w:sz="4"/>
+          <w:insideV w:val="single" w:color="E5E7EB" w:sz="4"/>
         </w:tblBorders>
       </w:tblPr>
       <w:tblGrid>
-        <w:gridCol w:w="1872"/>
-        <w:gridCol w:w="7488"/>
+        <w:gridCol w:w="2059"/>
+        <w:gridCol w:w="7301"/>
       </w:tblGrid>
       <w:tr>
         <w:trPr>
@@ -151,19 +150,13 @@
         </w:trPr>
         <w:tc>
           <w:tcPr>
-            <w:tcW w:type="dxa" w:w="1872"/>
-            <w:tcBorders>
-              <w:top w:val="single" w:color="E2E2E2" w:sz="4"/>
-              <w:left w:val="single" w:color="E2E2E2" w:sz="4"/>
-              <w:bottom w:val="single" w:color="E2E2E2" w:sz="4"/>
-              <w:right w:val="single" w:color="E2E2E2" w:sz="4"/>
-            </w:tcBorders>
+            <w:tcW w:type="dxa" w:w="2059"/>
             <w:shd w:fill="9B2C2C" w:color="auto" w:val="clear"/>
             <w:tcMar>
-              <w:top w:type="dxa" w:w="60"/>
-              <w:left w:type="dxa" w:w="100"/>
-              <w:bottom w:type="dxa" w:w="60"/>
-              <w:right w:type="dxa" w:w="100"/>
+              <w:top w:type="dxa" w:w="90"/>
+              <w:left w:type="dxa" w:w="110"/>
+              <w:bottom w:type="dxa" w:w="90"/>
+              <w:right w:type="dxa" w:w="110"/>
             </w:tcMar>
           </w:tcPr>
           <w:p>
@@ -182,19 +175,13 @@
         </w:tc>
         <w:tc>
           <w:tcPr>
-            <w:tcW w:type="dxa" w:w="7488"/>
-            <w:tcBorders>
-              <w:top w:val="single" w:color="E2E2E2" w:sz="4"/>
-              <w:left w:val="single" w:color="E2E2E2" w:sz="4"/>
-              <w:bottom w:val="single" w:color="E2E2E2" w:sz="4"/>
-              <w:right w:val="single" w:color="E2E2E2" w:sz="4"/>
-            </w:tcBorders>
+            <w:tcW w:type="dxa" w:w="7301"/>
             <w:shd w:fill="9B2C2C" w:color="auto" w:val="clear"/>
             <w:tcMar>
-              <w:top w:type="dxa" w:w="60"/>
-              <w:left w:type="dxa" w:w="100"/>
-              <w:bottom w:type="dxa" w:w="60"/>
-              <w:right w:type="dxa" w:w="100"/>
+              <w:top w:type="dxa" w:w="90"/>
+              <w:left w:type="dxa" w:w="110"/>
+              <w:bottom w:type="dxa" w:w="90"/>
+              <w:right w:type="dxa" w:w="110"/>
             </w:tcMar>
           </w:tcPr>
           <w:p>
@@ -214,34 +201,32 @@
       </w:tr>
       <w:tr>
         <w:trPr>
-          <w:trHeight w:val="560" w:hRule="atLeast"/>
+          <w:cantSplit/>
         </w:trPr>
         <w:tc>
           <w:tcPr>
-            <w:tcW w:type="dxa" w:w="1872"/>
-            <w:tcBorders>
-              <w:top w:val="single" w:color="E2E2E2" w:sz="4"/>
-              <w:left w:val="single" w:color="E2E2E2" w:sz="4"/>
-              <w:bottom w:val="single" w:color="E2E2E2" w:sz="4"/>
-              <w:right w:val="single" w:color="E2E2E2" w:sz="4"/>
-            </w:tcBorders>
+            <w:tcW w:type="dxa" w:w="2059"/>
             <w:shd w:fill="F7ECEC" w:color="auto" w:val="clear"/>
             <w:tcMar>
-              <w:top w:type="dxa" w:w="60"/>
-              <w:left w:type="dxa" w:w="100"/>
-              <w:bottom w:type="dxa" w:w="60"/>
-              <w:right w:type="dxa" w:w="100"/>
-            </w:tcMar>
-          </w:tcPr>
-          <w:p>
+              <w:top w:type="dxa" w:w="90"/>
+              <w:left w:type="dxa" w:w="110"/>
+              <w:bottom w:type="dxa" w:w="90"/>
+              <w:right w:type="dxa" w:w="110"/>
+            </w:tcMar>
+            <w:vAlign w:val="top"/>
+          </w:tcPr>
+          <w:p>
+            <w:pPr>
+              <w:spacing w:after="20"/>
+            </w:pPr>
             <w:r>
               <w:rPr>
                 <w:rFonts w:ascii="Calibri" w:cs="Calibri" w:eastAsia="Calibri" w:hAnsi="Calibri"/>
                 <w:b/>
                 <w:bCs/>
-                <w:color w:val="7A2626"/>
-                <w:sz w:val="22"/>
-                <w:szCs w:val="22"/>
+                <w:color w:val="1F2933"/>
+                <w:sz w:val="21"/>
+                <w:szCs w:val="21"/>
               </w:rPr>
               <w:t xml:space="preserve">Focus</w:t>
             </w:r>
@@ -249,27 +234,27 @@
         </w:tc>
         <w:tc>
           <w:tcPr>
-            <w:tcW w:type="dxa" w:w="7488"/>
-            <w:tcBorders>
-              <w:top w:val="single" w:color="E2E2E2" w:sz="4"/>
-              <w:left w:val="single" w:color="E2E2E2" w:sz="4"/>
-              <w:bottom w:val="single" w:color="E2E2E2" w:sz="4"/>
-              <w:right w:val="single" w:color="E2E2E2" w:sz="4"/>
-            </w:tcBorders>
-            <w:tcMar>
-              <w:top w:type="dxa" w:w="60"/>
-              <w:left w:type="dxa" w:w="100"/>
-              <w:bottom w:type="dxa" w:w="60"/>
-              <w:right w:type="dxa" w:w="100"/>
-            </w:tcMar>
-          </w:tcPr>
-          <w:p>
-            <w:r>
-              <w:rPr>
-                <w:rFonts w:ascii="Calibri" w:cs="Calibri" w:eastAsia="Calibri" w:hAnsi="Calibri"/>
+            <w:tcW w:type="dxa" w:w="7301"/>
+            <w:tcMar>
+              <w:top w:type="dxa" w:w="90"/>
+              <w:left w:type="dxa" w:w="110"/>
+              <w:bottom w:type="dxa" w:w="90"/>
+              <w:right w:type="dxa" w:w="110"/>
+            </w:tcMar>
+            <w:vAlign w:val="top"/>
+          </w:tcPr>
+          <w:p>
+            <w:pPr>
+              <w:spacing w:after="20"/>
+            </w:pPr>
+            <w:r>
+              <w:rPr>
+                <w:rFonts w:ascii="Calibri" w:cs="Calibri" w:eastAsia="Calibri" w:hAnsi="Calibri"/>
+                <w:b w:val="false"/>
+                <w:bCs w:val="false"/>
                 <w:color w:val="1F2933"/>
-                <w:sz w:val="22"/>
-                <w:szCs w:val="22"/>
+                <w:sz w:val="21"/>
+                <w:szCs w:val="21"/>
               </w:rPr>
               <w:t xml:space="preserve">What do we want students to learn?</w:t>
             </w:r>
@@ -278,34 +263,32 @@
       </w:tr>
       <w:tr>
         <w:trPr>
-          <w:trHeight w:val="560" w:hRule="atLeast"/>
+          <w:cantSplit/>
         </w:trPr>
         <w:tc>
           <w:tcPr>
-            <w:tcW w:type="dxa" w:w="1872"/>
-            <w:tcBorders>
-              <w:top w:val="single" w:color="E2E2E2" w:sz="4"/>
-              <w:left w:val="single" w:color="E2E2E2" w:sz="4"/>
-              <w:bottom w:val="single" w:color="E2E2E2" w:sz="4"/>
-              <w:right w:val="single" w:color="E2E2E2" w:sz="4"/>
-            </w:tcBorders>
+            <w:tcW w:type="dxa" w:w="2059"/>
             <w:shd w:fill="F7ECEC" w:color="auto" w:val="clear"/>
             <w:tcMar>
-              <w:top w:type="dxa" w:w="60"/>
-              <w:left w:type="dxa" w:w="100"/>
-              <w:bottom w:type="dxa" w:w="60"/>
-              <w:right w:type="dxa" w:w="100"/>
-            </w:tcMar>
-          </w:tcPr>
-          <w:p>
+              <w:top w:type="dxa" w:w="90"/>
+              <w:left w:type="dxa" w:w="110"/>
+              <w:bottom w:type="dxa" w:w="90"/>
+              <w:right w:type="dxa" w:w="110"/>
+            </w:tcMar>
+            <w:vAlign w:val="top"/>
+          </w:tcPr>
+          <w:p>
+            <w:pPr>
+              <w:spacing w:after="20"/>
+            </w:pPr>
             <w:r>
               <w:rPr>
                 <w:rFonts w:ascii="Calibri" w:cs="Calibri" w:eastAsia="Calibri" w:hAnsi="Calibri"/>
                 <w:b/>
                 <w:bCs/>
-                <w:color w:val="7A2626"/>
-                <w:sz w:val="22"/>
-                <w:szCs w:val="22"/>
+                <w:color w:val="1F2933"/>
+                <w:sz w:val="21"/>
+                <w:szCs w:val="21"/>
               </w:rPr>
               <w:t xml:space="preserve">Leave with</w:t>
             </w:r>
@@ -313,27 +296,27 @@
         </w:tc>
         <w:tc>
           <w:tcPr>
-            <w:tcW w:type="dxa" w:w="7488"/>
-            <w:tcBorders>
-              <w:top w:val="single" w:color="E2E2E2" w:sz="4"/>
-              <w:left w:val="single" w:color="E2E2E2" w:sz="4"/>
-              <w:bottom w:val="single" w:color="E2E2E2" w:sz="4"/>
-              <w:right w:val="single" w:color="E2E2E2" w:sz="4"/>
-            </w:tcBorders>
-            <w:tcMar>
-              <w:top w:type="dxa" w:w="60"/>
-              <w:left w:type="dxa" w:w="100"/>
-              <w:bottom w:type="dxa" w:w="60"/>
-              <w:right w:type="dxa" w:w="100"/>
-            </w:tcMar>
-          </w:tcPr>
-          <w:p>
-            <w:r>
-              <w:rPr>
-                <w:rFonts w:ascii="Calibri" w:cs="Calibri" w:eastAsia="Calibri" w:hAnsi="Calibri"/>
+            <w:tcW w:type="dxa" w:w="7301"/>
+            <w:tcMar>
+              <w:top w:type="dxa" w:w="90"/>
+              <w:left w:type="dxa" w:w="110"/>
+              <w:bottom w:type="dxa" w:w="90"/>
+              <w:right w:type="dxa" w:w="110"/>
+            </w:tcMar>
+            <w:vAlign w:val="top"/>
+          </w:tcPr>
+          <w:p>
+            <w:pPr>
+              <w:spacing w:after="20"/>
+            </w:pPr>
+            <w:r>
+              <w:rPr>
+                <w:rFonts w:ascii="Calibri" w:cs="Calibri" w:eastAsia="Calibri" w:hAnsi="Calibri"/>
+                <w:b w:val="false"/>
+                <w:bCs w:val="false"/>
                 <w:color w:val="1F2933"/>
-                <w:sz w:val="22"/>
-                <w:szCs w:val="22"/>
+                <w:sz w:val="21"/>
+                <w:szCs w:val="21"/>
               </w:rPr>
               <w:t xml:space="preserve">One selected essential standard.</w:t>
             </w:r>
@@ -343,7 +326,8 @@
     </w:tbl>
     <w:p>
       <w:pPr>
-        <w:spacing w:after="90" w:before="220"/>
+        <w:keepNext/>
+        <w:spacing w:after="80" w:before="200"/>
       </w:pPr>
       <w:r>
         <w:rPr>
@@ -351,8 +335,8 @@
           <w:b/>
           <w:bCs/>
           <w:color w:val="9B2C2C"/>
-          <w:sz w:val="26"/>
-          <w:szCs w:val="26"/>
+          <w:sz w:val="25"/>
+          <w:szCs w:val="25"/>
         </w:rPr>
         <w:t xml:space="preserve">Agenda — step by step</w:t>
       </w:r>
@@ -361,12 +345,12 @@
       <w:tblPr>
         <w:tblW w:type="dxa" w:w="9360"/>
         <w:tblBorders>
-          <w:top w:val="single" w:color="auto" w:sz="4"/>
-          <w:left w:val="single" w:color="auto" w:sz="4"/>
-          <w:bottom w:val="single" w:color="auto" w:sz="4"/>
-          <w:right w:val="single" w:color="auto" w:sz="4"/>
-          <w:insideH w:val="single" w:color="auto" w:sz="4"/>
-          <w:insideV w:val="single" w:color="auto" w:sz="4"/>
+          <w:top w:val="single" w:color="E5E7EB" w:sz="4"/>
+          <w:left w:val="single" w:color="E5E7EB" w:sz="4"/>
+          <w:bottom w:val="single" w:color="E5E7EB" w:sz="4"/>
+          <w:right w:val="single" w:color="E5E7EB" w:sz="4"/>
+          <w:insideH w:val="single" w:color="E5E7EB" w:sz="4"/>
+          <w:insideV w:val="single" w:color="E5E7EB" w:sz="4"/>
         </w:tblBorders>
       </w:tblPr>
       <w:tblGrid>
@@ -380,18 +364,12 @@
         <w:tc>
           <w:tcPr>
             <w:tcW w:type="dxa" w:w="1404"/>
-            <w:tcBorders>
-              <w:top w:val="single" w:color="E2E2E2" w:sz="4"/>
-              <w:left w:val="single" w:color="E2E2E2" w:sz="4"/>
-              <w:bottom w:val="single" w:color="E2E2E2" w:sz="4"/>
-              <w:right w:val="single" w:color="E2E2E2" w:sz="4"/>
-            </w:tcBorders>
             <w:shd w:fill="9B2C2C" w:color="auto" w:val="clear"/>
             <w:tcMar>
-              <w:top w:type="dxa" w:w="60"/>
-              <w:left w:type="dxa" w:w="100"/>
-              <w:bottom w:type="dxa" w:w="60"/>
-              <w:right w:type="dxa" w:w="100"/>
+              <w:top w:type="dxa" w:w="90"/>
+              <w:left w:type="dxa" w:w="110"/>
+              <w:bottom w:type="dxa" w:w="90"/>
+              <w:right w:type="dxa" w:w="110"/>
             </w:tcMar>
           </w:tcPr>
           <w:p>
@@ -411,18 +389,12 @@
         <w:tc>
           <w:tcPr>
             <w:tcW w:type="dxa" w:w="7956"/>
-            <w:tcBorders>
-              <w:top w:val="single" w:color="E2E2E2" w:sz="4"/>
-              <w:left w:val="single" w:color="E2E2E2" w:sz="4"/>
-              <w:bottom w:val="single" w:color="E2E2E2" w:sz="4"/>
-              <w:right w:val="single" w:color="E2E2E2" w:sz="4"/>
-            </w:tcBorders>
             <w:shd w:fill="9B2C2C" w:color="auto" w:val="clear"/>
             <w:tcMar>
-              <w:top w:type="dxa" w:w="60"/>
-              <w:left w:type="dxa" w:w="100"/>
-              <w:bottom w:type="dxa" w:w="60"/>
-              <w:right w:type="dxa" w:w="100"/>
+              <w:top w:type="dxa" w:w="90"/>
+              <w:left w:type="dxa" w:w="110"/>
+              <w:bottom w:type="dxa" w:w="90"/>
+              <w:right w:type="dxa" w:w="110"/>
             </w:tcMar>
           </w:tcPr>
           <w:p>
@@ -442,34 +414,32 @@
       </w:tr>
       <w:tr>
         <w:trPr>
-          <w:trHeight w:val="560" w:hRule="atLeast"/>
+          <w:cantSplit/>
         </w:trPr>
         <w:tc>
           <w:tcPr>
             <w:tcW w:type="dxa" w:w="1404"/>
-            <w:tcBorders>
-              <w:top w:val="single" w:color="E2E2E2" w:sz="4"/>
-              <w:left w:val="single" w:color="E2E2E2" w:sz="4"/>
-              <w:bottom w:val="single" w:color="E2E2E2" w:sz="4"/>
-              <w:right w:val="single" w:color="E2E2E2" w:sz="4"/>
-            </w:tcBorders>
             <w:shd w:fill="F7ECEC" w:color="auto" w:val="clear"/>
             <w:tcMar>
-              <w:top w:type="dxa" w:w="60"/>
-              <w:left w:type="dxa" w:w="100"/>
-              <w:bottom w:type="dxa" w:w="60"/>
-              <w:right w:type="dxa" w:w="100"/>
-            </w:tcMar>
-          </w:tcPr>
-          <w:p>
+              <w:top w:type="dxa" w:w="90"/>
+              <w:left w:type="dxa" w:w="110"/>
+              <w:bottom w:type="dxa" w:w="90"/>
+              <w:right w:type="dxa" w:w="110"/>
+            </w:tcMar>
+            <w:vAlign w:val="top"/>
+          </w:tcPr>
+          <w:p>
+            <w:pPr>
+              <w:spacing w:after="20"/>
+            </w:pPr>
             <w:r>
               <w:rPr>
                 <w:rFonts w:ascii="Calibri" w:cs="Calibri" w:eastAsia="Calibri" w:hAnsi="Calibri"/>
                 <w:b/>
                 <w:bCs/>
-                <w:color w:val="7A2626"/>
-                <w:sz w:val="22"/>
-                <w:szCs w:val="22"/>
+                <w:color w:val="1F2933"/>
+                <w:sz w:val="21"/>
+                <w:szCs w:val="21"/>
               </w:rPr>
               <w:t xml:space="preserve">0–5 min</w:t>
             </w:r>
@@ -478,26 +448,26 @@
         <w:tc>
           <w:tcPr>
             <w:tcW w:type="dxa" w:w="7956"/>
-            <w:tcBorders>
-              <w:top w:val="single" w:color="E2E2E2" w:sz="4"/>
-              <w:left w:val="single" w:color="E2E2E2" w:sz="4"/>
-              <w:bottom w:val="single" w:color="E2E2E2" w:sz="4"/>
-              <w:right w:val="single" w:color="E2E2E2" w:sz="4"/>
-            </w:tcBorders>
-            <w:tcMar>
-              <w:top w:type="dxa" w:w="60"/>
-              <w:left w:type="dxa" w:w="100"/>
-              <w:bottom w:type="dxa" w:w="60"/>
-              <w:right w:type="dxa" w:w="100"/>
-            </w:tcMar>
-          </w:tcPr>
-          <w:p>
-            <w:r>
-              <w:rPr>
-                <w:rFonts w:ascii="Calibri" w:cs="Calibri" w:eastAsia="Calibri" w:hAnsi="Calibri"/>
+            <w:tcMar>
+              <w:top w:type="dxa" w:w="90"/>
+              <w:left w:type="dxa" w:w="110"/>
+              <w:bottom w:type="dxa" w:w="90"/>
+              <w:right w:type="dxa" w:w="110"/>
+            </w:tcMar>
+            <w:vAlign w:val="top"/>
+          </w:tcPr>
+          <w:p>
+            <w:pPr>
+              <w:spacing w:after="20"/>
+            </w:pPr>
+            <w:r>
+              <w:rPr>
+                <w:rFonts w:ascii="Calibri" w:cs="Calibri" w:eastAsia="Calibri" w:hAnsi="Calibri"/>
+                <w:b w:val="false"/>
+                <w:bCs w:val="false"/>
                 <w:color w:val="1F2933"/>
-                <w:sz w:val="22"/>
-                <w:szCs w:val="22"/>
+                <w:sz w:val="21"/>
+                <w:szCs w:val="21"/>
               </w:rPr>
               <w:t xml:space="preserve">Review norms and roles. Confirm who holds each role today and re-read your team norms together. This is where the learning cycle begins — your team will pick one essential standard to guarantee. Pull up the standards for your course.</w:t>
             </w:r>
@@ -506,34 +476,32 @@
       </w:tr>
       <w:tr>
         <w:trPr>
-          <w:trHeight w:val="560" w:hRule="atLeast"/>
+          <w:cantSplit/>
         </w:trPr>
         <w:tc>
           <w:tcPr>
             <w:tcW w:type="dxa" w:w="1404"/>
-            <w:tcBorders>
-              <w:top w:val="single" w:color="E2E2E2" w:sz="4"/>
-              <w:left w:val="single" w:color="E2E2E2" w:sz="4"/>
-              <w:bottom w:val="single" w:color="E2E2E2" w:sz="4"/>
-              <w:right w:val="single" w:color="E2E2E2" w:sz="4"/>
-            </w:tcBorders>
             <w:shd w:fill="F7ECEC" w:color="auto" w:val="clear"/>
             <w:tcMar>
-              <w:top w:type="dxa" w:w="60"/>
-              <w:left w:type="dxa" w:w="100"/>
-              <w:bottom w:type="dxa" w:w="60"/>
-              <w:right w:type="dxa" w:w="100"/>
-            </w:tcMar>
-          </w:tcPr>
-          <w:p>
+              <w:top w:type="dxa" w:w="90"/>
+              <w:left w:type="dxa" w:w="110"/>
+              <w:bottom w:type="dxa" w:w="90"/>
+              <w:right w:type="dxa" w:w="110"/>
+            </w:tcMar>
+            <w:vAlign w:val="top"/>
+          </w:tcPr>
+          <w:p>
+            <w:pPr>
+              <w:spacing w:after="20"/>
+            </w:pPr>
             <w:r>
               <w:rPr>
                 <w:rFonts w:ascii="Calibri" w:cs="Calibri" w:eastAsia="Calibri" w:hAnsi="Calibri"/>
                 <w:b/>
                 <w:bCs/>
-                <w:color w:val="7A2626"/>
-                <w:sz w:val="22"/>
-                <w:szCs w:val="22"/>
+                <w:color w:val="1F2933"/>
+                <w:sz w:val="21"/>
+                <w:szCs w:val="21"/>
               </w:rPr>
               <w:t xml:space="preserve">5–15 min</w:t>
             </w:r>
@@ -542,26 +510,26 @@
         <w:tc>
           <w:tcPr>
             <w:tcW w:type="dxa" w:w="7956"/>
-            <w:tcBorders>
-              <w:top w:val="single" w:color="E2E2E2" w:sz="4"/>
-              <w:left w:val="single" w:color="E2E2E2" w:sz="4"/>
-              <w:bottom w:val="single" w:color="E2E2E2" w:sz="4"/>
-              <w:right w:val="single" w:color="E2E2E2" w:sz="4"/>
-            </w:tcBorders>
-            <w:tcMar>
-              <w:top w:type="dxa" w:w="60"/>
-              <w:left w:type="dxa" w:w="100"/>
-              <w:bottom w:type="dxa" w:w="60"/>
-              <w:right w:type="dxa" w:w="100"/>
-            </w:tcMar>
-          </w:tcPr>
-          <w:p>
-            <w:r>
-              <w:rPr>
-                <w:rFonts w:ascii="Calibri" w:cs="Calibri" w:eastAsia="Calibri" w:hAnsi="Calibri"/>
+            <w:tcMar>
+              <w:top w:type="dxa" w:w="90"/>
+              <w:left w:type="dxa" w:w="110"/>
+              <w:bottom w:type="dxa" w:w="90"/>
+              <w:right w:type="dxa" w:w="110"/>
+            </w:tcMar>
+            <w:vAlign w:val="top"/>
+          </w:tcPr>
+          <w:p>
+            <w:pPr>
+              <w:spacing w:after="20"/>
+            </w:pPr>
+            <w:r>
+              <w:rPr>
+                <w:rFonts w:ascii="Calibri" w:cs="Calibri" w:eastAsia="Calibri" w:hAnsi="Calibri"/>
+                <w:b w:val="false"/>
+                <w:bCs w:val="false"/>
                 <w:color w:val="1F2933"/>
-                <w:sz w:val="22"/>
-                <w:szCs w:val="22"/>
+                <w:sz w:val="21"/>
+                <w:szCs w:val="21"/>
               </w:rPr>
               <w:t xml:space="preserve">Teach vs. learn. Discuss the difference between what we teach and what students must learn.</w:t>
             </w:r>
@@ -570,34 +538,32 @@
       </w:tr>
       <w:tr>
         <w:trPr>
-          <w:trHeight w:val="560" w:hRule="atLeast"/>
+          <w:cantSplit/>
         </w:trPr>
         <w:tc>
           <w:tcPr>
             <w:tcW w:type="dxa" w:w="1404"/>
-            <w:tcBorders>
-              <w:top w:val="single" w:color="E2E2E2" w:sz="4"/>
-              <w:left w:val="single" w:color="E2E2E2" w:sz="4"/>
-              <w:bottom w:val="single" w:color="E2E2E2" w:sz="4"/>
-              <w:right w:val="single" w:color="E2E2E2" w:sz="4"/>
-            </w:tcBorders>
             <w:shd w:fill="F7ECEC" w:color="auto" w:val="clear"/>
             <w:tcMar>
-              <w:top w:type="dxa" w:w="60"/>
-              <w:left w:type="dxa" w:w="100"/>
-              <w:bottom w:type="dxa" w:w="60"/>
-              <w:right w:type="dxa" w:w="100"/>
-            </w:tcMar>
-          </w:tcPr>
-          <w:p>
+              <w:top w:type="dxa" w:w="90"/>
+              <w:left w:type="dxa" w:w="110"/>
+              <w:bottom w:type="dxa" w:w="90"/>
+              <w:right w:type="dxa" w:w="110"/>
+            </w:tcMar>
+            <w:vAlign w:val="top"/>
+          </w:tcPr>
+          <w:p>
+            <w:pPr>
+              <w:spacing w:after="20"/>
+            </w:pPr>
             <w:r>
               <w:rPr>
                 <w:rFonts w:ascii="Calibri" w:cs="Calibri" w:eastAsia="Calibri" w:hAnsi="Calibri"/>
                 <w:b/>
                 <w:bCs/>
-                <w:color w:val="7A2626"/>
-                <w:sz w:val="22"/>
-                <w:szCs w:val="22"/>
+                <w:color w:val="1F2933"/>
+                <w:sz w:val="21"/>
+                <w:szCs w:val="21"/>
               </w:rPr>
               <w:t xml:space="preserve">15–35 min</w:t>
             </w:r>
@@ -606,26 +572,26 @@
         <w:tc>
           <w:tcPr>
             <w:tcW w:type="dxa" w:w="7956"/>
-            <w:tcBorders>
-              <w:top w:val="single" w:color="E2E2E2" w:sz="4"/>
-              <w:left w:val="single" w:color="E2E2E2" w:sz="4"/>
-              <w:bottom w:val="single" w:color="E2E2E2" w:sz="4"/>
-              <w:right w:val="single" w:color="E2E2E2" w:sz="4"/>
-            </w:tcBorders>
-            <w:tcMar>
-              <w:top w:type="dxa" w:w="60"/>
-              <w:left w:type="dxa" w:w="100"/>
-              <w:bottom w:type="dxa" w:w="60"/>
-              <w:right w:type="dxa" w:w="100"/>
-            </w:tcMar>
-          </w:tcPr>
-          <w:p>
-            <w:r>
-              <w:rPr>
-                <w:rFonts w:ascii="Calibri" w:cs="Calibri" w:eastAsia="Calibri" w:hAnsi="Calibri"/>
+            <w:tcMar>
+              <w:top w:type="dxa" w:w="90"/>
+              <w:left w:type="dxa" w:w="110"/>
+              <w:bottom w:type="dxa" w:w="90"/>
+              <w:right w:type="dxa" w:w="110"/>
+            </w:tcMar>
+            <w:vAlign w:val="top"/>
+          </w:tcPr>
+          <w:p>
+            <w:pPr>
+              <w:spacing w:after="20"/>
+            </w:pPr>
+            <w:r>
+              <w:rPr>
+                <w:rFonts w:ascii="Calibri" w:cs="Calibri" w:eastAsia="Calibri" w:hAnsi="Calibri"/>
+                <w:b w:val="false"/>
+                <w:bCs w:val="false"/>
                 <w:color w:val="1F2933"/>
-                <w:sz w:val="22"/>
-                <w:szCs w:val="22"/>
+                <w:sz w:val="21"/>
+                <w:szCs w:val="21"/>
               </w:rPr>
               <w:t xml:space="preserve">Choose one essential standard. Review your standards and use REAL — readiness, endurance, assessed, leverage — to select just one.</w:t>
             </w:r>
@@ -634,34 +600,32 @@
       </w:tr>
       <w:tr>
         <w:trPr>
-          <w:trHeight w:val="560" w:hRule="atLeast"/>
+          <w:cantSplit/>
         </w:trPr>
         <w:tc>
           <w:tcPr>
             <w:tcW w:type="dxa" w:w="1404"/>
-            <w:tcBorders>
-              <w:top w:val="single" w:color="E2E2E2" w:sz="4"/>
-              <w:left w:val="single" w:color="E2E2E2" w:sz="4"/>
-              <w:bottom w:val="single" w:color="E2E2E2" w:sz="4"/>
-              <w:right w:val="single" w:color="E2E2E2" w:sz="4"/>
-            </w:tcBorders>
             <w:shd w:fill="F7ECEC" w:color="auto" w:val="clear"/>
             <w:tcMar>
-              <w:top w:type="dxa" w:w="60"/>
-              <w:left w:type="dxa" w:w="100"/>
-              <w:bottom w:type="dxa" w:w="60"/>
-              <w:right w:type="dxa" w:w="100"/>
-            </w:tcMar>
-          </w:tcPr>
-          <w:p>
+              <w:top w:type="dxa" w:w="90"/>
+              <w:left w:type="dxa" w:w="110"/>
+              <w:bottom w:type="dxa" w:w="90"/>
+              <w:right w:type="dxa" w:w="110"/>
+            </w:tcMar>
+            <w:vAlign w:val="top"/>
+          </w:tcPr>
+          <w:p>
+            <w:pPr>
+              <w:spacing w:after="20"/>
+            </w:pPr>
             <w:r>
               <w:rPr>
                 <w:rFonts w:ascii="Calibri" w:cs="Calibri" w:eastAsia="Calibri" w:hAnsi="Calibri"/>
                 <w:b/>
                 <w:bCs/>
-                <w:color w:val="7A2626"/>
-                <w:sz w:val="22"/>
-                <w:szCs w:val="22"/>
+                <w:color w:val="1F2933"/>
+                <w:sz w:val="21"/>
+                <w:szCs w:val="21"/>
               </w:rPr>
               <w:t xml:space="preserve">35–43 min</w:t>
             </w:r>
@@ -670,26 +634,26 @@
         <w:tc>
           <w:tcPr>
             <w:tcW w:type="dxa" w:w="7956"/>
-            <w:tcBorders>
-              <w:top w:val="single" w:color="E2E2E2" w:sz="4"/>
-              <w:left w:val="single" w:color="E2E2E2" w:sz="4"/>
-              <w:bottom w:val="single" w:color="E2E2E2" w:sz="4"/>
-              <w:right w:val="single" w:color="E2E2E2" w:sz="4"/>
-            </w:tcBorders>
-            <w:tcMar>
-              <w:top w:type="dxa" w:w="60"/>
-              <w:left w:type="dxa" w:w="100"/>
-              <w:bottom w:type="dxa" w:w="60"/>
-              <w:right w:type="dxa" w:w="100"/>
-            </w:tcMar>
-          </w:tcPr>
-          <w:p>
-            <w:r>
-              <w:rPr>
-                <w:rFonts w:ascii="Calibri" w:cs="Calibri" w:eastAsia="Calibri" w:hAnsi="Calibri"/>
+            <w:tcMar>
+              <w:top w:type="dxa" w:w="90"/>
+              <w:left w:type="dxa" w:w="110"/>
+              <w:bottom w:type="dxa" w:w="90"/>
+              <w:right w:type="dxa" w:w="110"/>
+            </w:tcMar>
+            <w:vAlign w:val="top"/>
+          </w:tcPr>
+          <w:p>
+            <w:pPr>
+              <w:spacing w:after="20"/>
+            </w:pPr>
+            <w:r>
+              <w:rPr>
+                <w:rFonts w:ascii="Calibri" w:cs="Calibri" w:eastAsia="Calibri" w:hAnsi="Calibri"/>
+                <w:b w:val="false"/>
+                <w:bCs w:val="false"/>
                 <w:color w:val="1F2933"/>
-                <w:sz w:val="22"/>
-                <w:szCs w:val="22"/>
+                <w:sz w:val="21"/>
+                <w:szCs w:val="21"/>
               </w:rPr>
               <w:t xml:space="preserve">Confirm it. Agree on the single essential standard for this cycle.</w:t>
             </w:r>
@@ -698,34 +662,32 @@
       </w:tr>
       <w:tr>
         <w:trPr>
-          <w:trHeight w:val="560" w:hRule="atLeast"/>
+          <w:cantSplit/>
         </w:trPr>
         <w:tc>
           <w:tcPr>
             <w:tcW w:type="dxa" w:w="1404"/>
-            <w:tcBorders>
-              <w:top w:val="single" w:color="E2E2E2" w:sz="4"/>
-              <w:left w:val="single" w:color="E2E2E2" w:sz="4"/>
-              <w:bottom w:val="single" w:color="E2E2E2" w:sz="4"/>
-              <w:right w:val="single" w:color="E2E2E2" w:sz="4"/>
-            </w:tcBorders>
             <w:shd w:fill="F7ECEC" w:color="auto" w:val="clear"/>
             <w:tcMar>
-              <w:top w:type="dxa" w:w="60"/>
-              <w:left w:type="dxa" w:w="100"/>
-              <w:bottom w:type="dxa" w:w="60"/>
-              <w:right w:type="dxa" w:w="100"/>
-            </w:tcMar>
-          </w:tcPr>
-          <w:p>
+              <w:top w:type="dxa" w:w="90"/>
+              <w:left w:type="dxa" w:w="110"/>
+              <w:bottom w:type="dxa" w:w="90"/>
+              <w:right w:type="dxa" w:w="110"/>
+            </w:tcMar>
+            <w:vAlign w:val="top"/>
+          </w:tcPr>
+          <w:p>
+            <w:pPr>
+              <w:spacing w:after="20"/>
+            </w:pPr>
             <w:r>
               <w:rPr>
                 <w:rFonts w:ascii="Calibri" w:cs="Calibri" w:eastAsia="Calibri" w:hAnsi="Calibri"/>
                 <w:b/>
                 <w:bCs/>
-                <w:color w:val="7A2626"/>
-                <w:sz w:val="22"/>
-                <w:szCs w:val="22"/>
+                <w:color w:val="1F2933"/>
+                <w:sz w:val="21"/>
+                <w:szCs w:val="21"/>
               </w:rPr>
               <w:t xml:space="preserve">43–45 min</w:t>
             </w:r>
@@ -734,28 +696,28 @@
         <w:tc>
           <w:tcPr>
             <w:tcW w:type="dxa" w:w="7956"/>
-            <w:tcBorders>
-              <w:top w:val="single" w:color="E2E2E2" w:sz="4"/>
-              <w:left w:val="single" w:color="E2E2E2" w:sz="4"/>
-              <w:bottom w:val="single" w:color="E2E2E2" w:sz="4"/>
-              <w:right w:val="single" w:color="E2E2E2" w:sz="4"/>
-            </w:tcBorders>
-            <w:tcMar>
-              <w:top w:type="dxa" w:w="60"/>
-              <w:left w:type="dxa" w:w="100"/>
-              <w:bottom w:type="dxa" w:w="60"/>
-              <w:right w:type="dxa" w:w="100"/>
-            </w:tcMar>
-          </w:tcPr>
-          <w:p>
-            <w:r>
-              <w:rPr>
-                <w:rFonts w:ascii="Calibri" w:cs="Calibri" w:eastAsia="Calibri" w:hAnsi="Calibri"/>
+            <w:tcMar>
+              <w:top w:type="dxa" w:w="90"/>
+              <w:left w:type="dxa" w:w="110"/>
+              <w:bottom w:type="dxa" w:w="90"/>
+              <w:right w:type="dxa" w:w="110"/>
+            </w:tcMar>
+            <w:vAlign w:val="top"/>
+          </w:tcPr>
+          <w:p>
+            <w:pPr>
+              <w:spacing w:after="20"/>
+            </w:pPr>
+            <w:r>
+              <w:rPr>
+                <w:rFonts w:ascii="Calibri" w:cs="Calibri" w:eastAsia="Calibri" w:hAnsi="Calibri"/>
+                <w:b w:val="false"/>
+                <w:bCs w:val="false"/>
                 <w:color w:val="1F2933"/>
-                <w:sz w:val="22"/>
-                <w:szCs w:val="22"/>
-              </w:rPr>
-              <w:t xml:space="preserve">Assign pre-work. Bring student work samples, curriculum, and assessment examples next time.</w:t>
+                <w:sz w:val="21"/>
+                <w:szCs w:val="21"/>
+              </w:rPr>
+              <w:t xml:space="preserve">Assign pre-work. Bring the full text of your essential standard and your course's standards or curriculum materials for it — the raw material you'll break into learning targets next time.</w:t>
             </w:r>
           </w:p>
         </w:tc>
@@ -763,84 +725,42 @@
     </w:tbl>
     <w:p>
       <w:pPr>
-        <w:spacing w:before="140"/>
+        <w:shd w:fill="F7ECEC" w:color="auto" w:val="clear"/>
+        <w:spacing w:after="40" w:before="200"/>
       </w:pPr>
       <w:r>
         <w:rPr>
           <w:rFonts w:ascii="Calibri" w:cs="Calibri" w:eastAsia="Calibri" w:hAnsi="Calibri"/>
+          <w:b/>
+          <w:bCs/>
+          <w:color w:val="9B2C2C"/>
+          <w:sz w:val="22"/>
+          <w:szCs w:val="22"/>
         </w:rPr>
-        <w:t xml:space="preserve"/>
+        <w:t xml:space="preserve">Where we're going next → Meeting 6</w:t>
       </w:r>
     </w:p>
-    <w:tbl>
-      <w:tblPr>
-        <w:tblW w:type="dxa" w:w="9360"/>
-        <w:tblBorders>
-          <w:top w:val="single" w:color="auto" w:sz="4"/>
-          <w:left w:val="single" w:color="auto" w:sz="4"/>
-          <w:bottom w:val="single" w:color="auto" w:sz="4"/>
-          <w:right w:val="single" w:color="auto" w:sz="4"/>
-          <w:insideH w:val="single" w:color="auto" w:sz="4"/>
-          <w:insideV w:val="single" w:color="auto" w:sz="4"/>
-        </w:tblBorders>
-      </w:tblPr>
-      <w:tblGrid>
-        <w:gridCol w:w="9360"/>
-      </w:tblGrid>
-      <w:tr>
-        <w:tc>
-          <w:tcPr>
-            <w:tcW w:type="dxa" w:w="9360"/>
-            <w:tcBorders>
-              <w:top w:val="single" w:color="E0A99F" w:sz="8"/>
-              <w:left w:val="single" w:color="E0A99F" w:sz="8"/>
-              <w:bottom w:val="single" w:color="E0A99F" w:sz="8"/>
-              <w:right w:val="single" w:color="E0A99F" w:sz="8"/>
-            </w:tcBorders>
-            <w:shd w:fill="FDF3EF" w:color="auto" w:val="clear"/>
-            <w:tcMar>
-              <w:top w:type="dxa" w:w="120"/>
-              <w:left w:type="dxa" w:w="160"/>
-              <w:bottom w:type="dxa" w:w="120"/>
-              <w:right w:type="dxa" w:w="160"/>
-            </w:tcMar>
-          </w:tcPr>
-          <w:p>
-            <w:pPr>
-              <w:spacing w:after="30"/>
-            </w:pPr>
-            <w:r>
-              <w:rPr>
-                <w:rFonts w:ascii="Calibri" w:cs="Calibri" w:eastAsia="Calibri" w:hAnsi="Calibri"/>
-                <w:b/>
-                <w:bCs/>
-                <w:color w:val="9B2C2C"/>
-                <w:sz w:val="24"/>
-                <w:szCs w:val="24"/>
-              </w:rPr>
-              <w:t xml:space="preserve">Where we're going next → Meeting 6</w:t>
-            </w:r>
-          </w:p>
-          <w:p>
-            <w:r>
-              <w:rPr>
-                <w:rFonts w:ascii="Calibri" w:cs="Calibri" w:eastAsia="Calibri" w:hAnsi="Calibri"/>
-                <w:color w:val="1F2933"/>
-                <w:sz w:val="22"/>
-                <w:szCs w:val="22"/>
-              </w:rPr>
-              <w:t xml:space="preserve">Deconstructing the Essential Standard — Clarifying what students must know and be able to do.</w:t>
-            </w:r>
-          </w:p>
-        </w:tc>
-      </w:tr>
-    </w:tbl>
     <w:p>
       <w:pPr>
+        <w:shd w:fill="F7ECEC" w:color="auto" w:val="clear"/>
+        <w:spacing w:after="120"/>
+      </w:pPr>
+      <w:r>
+        <w:rPr>
+          <w:rFonts w:ascii="Calibri" w:cs="Calibri" w:eastAsia="Calibri" w:hAnsi="Calibri"/>
+          <w:color w:val="1F2933"/>
+          <w:sz w:val="22"/>
+          <w:szCs w:val="22"/>
+        </w:rPr>
+        <w:t xml:space="preserve">Deconstructing the Essential Standard — Clarifying what students must know and be able to do.</w:t>
+      </w:r>
+    </w:p>
+    <w:p>
+      <w:pPr>
         <w:pBdr>
-          <w:top w:val="single" w:color="E2E2E2" w:sz="4" w:space="8"/>
+          <w:top w:val="single" w:color="E5E7EB" w:sz="4" w:space="6"/>
         </w:pBdr>
-        <w:spacing w:before="180"/>
+        <w:spacing w:before="200"/>
       </w:pPr>
       <w:r>
         <w:rPr>
@@ -848,24 +768,20 @@
           <w:i/>
           <w:iCs/>
           <w:color w:val="64748B"/>
-          <w:sz w:val="15"/>
-          <w:szCs w:val="15"/>
+          <w:sz w:val="18"/>
+          <w:szCs w:val="18"/>
         </w:rPr>
         <w:t xml:space="preserve">Elsinore Middle School Professional Learning Teams · 2026–27 · Meeting 5 agenda.</w:t>
       </w:r>
     </w:p>
     <w:sectPr>
       <w:pgSz w:w="12240" w:h="15840" w:orient="portrait"/>
-      <w:pgMar w:top="900" w:right="1440" w:bottom="900" w:left="1440" w:header="708" w:footer="708" w:gutter="0"/>
+      <w:pgMar w:top="864" w:right="864" w:bottom="864" w:left="864" w:header="708" w:footer="708" w:gutter="0"/>
       <w:pgNumType/>
       <w:docGrid w:linePitch="360"/>
     </w:sectPr>
   </w:body>
 </w:document>
-</file>
-
-<file path=word/comments.xml><?xml version="1.0" encoding="utf-8"?>
-<w:comments xmlns:cx="http://schemas.microsoft.com/office/drawing/2014/chartex" xmlns:cx1="http://schemas.microsoft.com/office/drawing/2015/9/8/chartex" xmlns:cx2="http://schemas.microsoft.com/office/drawing/2015/10/21/chartex" xmlns:cx3="http://schemas.microsoft.com/office/drawing/2016/5/9/chartex" xmlns:cx4="http://schemas.microsoft.com/office/drawing/2016/5/10/chartex" xmlns:cx5="http://schemas.microsoft.com/office/drawing/2016/5/11/chartex" xmlns:cx6="http://schemas.microsoft.com/office/drawing/2016/5/12/chartex" xmlns:cx7="http://schemas.microsoft.com/office/drawing/2016/5/13/chartex" xmlns:cx8="http://schemas.microsoft.com/office/drawing/2016/5/14/chartex" xmlns:mc="http://schemas.openxmlformats.org/markup-compatibility/2006" xmlns:aink="http://schemas.microsoft.com/office/drawing/2016/ink" xmlns:am3d="http://schemas.microsoft.com/office/drawing/2017/model3d" xmlns:o="urn:schemas-microsoft-com:office:office" xmlns:r="http://schemas.openxmlformats.org/officeDocument/2006/relationships" xmlns:m="http://schemas.openxmlformats.org/officeDocument/2006/math" xmlns:v="urn:schemas-microsoft-com:vml" xmlns:wp14="http://schemas.microsoft.com/office/word/2010/wordprocessingDrawing" xmlns:wp="http://schemas.openxmlformats.org/drawingml/2006/wordprocessingDrawing" xmlns:w10="urn:schemas-microsoft-com:office:word" xmlns:w="http://schemas.openxmlformats.org/wordprocessingml/2006/main" xmlns:w14="http://schemas.microsoft.com/office/word/2010/wordml" xmlns:w15="http://schemas.microsoft.com/office/word/2012/wordml" xmlns:w16cex="http://schemas.microsoft.com/office/word/2018/wordml/cex" xmlns:w16cid="http://schemas.microsoft.com/office/word/2016/wordml/cid" xmlns:w16="http://schemas.microsoft.com/office/word/2018/wordml" xmlns:w16sdtdh="http://schemas.microsoft.com/office/word/2020/wordml/sdtdatahash" xmlns:w16se="http://schemas.microsoft.com/office/word/2015/wordml/symex" xmlns:wpg="http://schemas.microsoft.com/office/word/2010/wordprocessingGroup" xmlns:wpi="http://schemas.microsoft.com/office/word/2010/wordprocessingInk" xmlns:wne="http://schemas.microsoft.com/office/word/2006/wordml" xmlns:wps="http://schemas.microsoft.com/office/word/2010/wordprocessingShape"/>
 </file>
 
 <file path=word/endnotes.xml><?xml version="1.0" encoding="utf-8"?>
@@ -946,7 +862,7 @@
 <w:numbering xmlns:wpc="http://schemas.microsoft.com/office/word/2010/wordprocessingCanvas" xmlns:mc="http://schemas.openxmlformats.org/markup-compatibility/2006" xmlns:o="urn:schemas-microsoft-com:office:office" xmlns:r="http://schemas.openxmlformats.org/officeDocument/2006/relationships" xmlns:m="http://schemas.openxmlformats.org/officeDocument/2006/math" xmlns:v="urn:schemas-microsoft-com:vml" xmlns:wp14="http://schemas.microsoft.com/office/word/2010/wordprocessingDrawing" xmlns:wp="http://schemas.openxmlformats.org/drawingml/2006/wordprocessingDrawing" xmlns:w10="urn:schemas-microsoft-com:office:word" xmlns:w="http://schemas.openxmlformats.org/wordprocessingml/2006/main" xmlns:w14="http://schemas.microsoft.com/office/word/2010/wordml" xmlns:w15="http://schemas.microsoft.com/office/word/2012/wordml" xmlns:wpg="http://schemas.microsoft.com/office/word/2010/wordprocessingGroup" xmlns:wpi="http://schemas.microsoft.com/office/word/2010/wordprocessingInk" xmlns:wne="http://schemas.microsoft.com/office/word/2006/wordml" xmlns:wps="http://schemas.microsoft.com/office/word/2010/wordprocessingShape" mc:Ignorable="w14 w15 wp14">
   <w:abstractNum w:abstractNumId="1" w15:restartNumberingAfterBreak="0">
     <w:multiLevelType w:val="hybridMultilevel"/>
-    <w:lvl w:ilvl="0" w15:tentative="1">
+    <w:lvl w:ilvl="0" w:tentative="1">
       <w:start w:val="1"/>
       <w:numFmt w:val="bullet"/>
       <w:lvlText w:val="●"/>
@@ -955,7 +871,7 @@
         <w:ind w:left="720" w:hanging="360"/>
       </w:pPr>
     </w:lvl>
-    <w:lvl w:ilvl="1" w15:tentative="1">
+    <w:lvl w:ilvl="1" w:tentative="1">
       <w:start w:val="1"/>
       <w:numFmt w:val="bullet"/>
       <w:lvlText w:val="○"/>
@@ -964,7 +880,7 @@
         <w:ind w:left="1440" w:hanging="360"/>
       </w:pPr>
     </w:lvl>
-    <w:lvl w:ilvl="2" w15:tentative="1">
+    <w:lvl w:ilvl="2" w:tentative="1">
       <w:start w:val="1"/>
       <w:numFmt w:val="bullet"/>
       <w:lvlText w:val="■"/>
@@ -973,7 +889,7 @@
         <w:ind w:left="2160" w:hanging="360"/>
       </w:pPr>
     </w:lvl>
-    <w:lvl w:ilvl="3" w15:tentative="1">
+    <w:lvl w:ilvl="3" w:tentative="1">
       <w:start w:val="1"/>
       <w:numFmt w:val="bullet"/>
       <w:lvlText w:val="●"/>
@@ -982,7 +898,7 @@
         <w:ind w:left="2880" w:hanging="360"/>
       </w:pPr>
     </w:lvl>
-    <w:lvl w:ilvl="4" w15:tentative="1">
+    <w:lvl w:ilvl="4" w:tentative="1">
       <w:start w:val="1"/>
       <w:numFmt w:val="bullet"/>
       <w:lvlText w:val="○"/>
@@ -991,7 +907,7 @@
         <w:ind w:left="3600" w:hanging="360"/>
       </w:pPr>
     </w:lvl>
-    <w:lvl w:ilvl="5" w15:tentative="1">
+    <w:lvl w:ilvl="5" w:tentative="1">
       <w:start w:val="1"/>
       <w:numFmt w:val="bullet"/>
       <w:lvlText w:val="■"/>
@@ -1000,7 +916,7 @@
         <w:ind w:left="4320" w:hanging="360"/>
       </w:pPr>
     </w:lvl>
-    <w:lvl w:ilvl="6" w15:tentative="1">
+    <w:lvl w:ilvl="6" w:tentative="1">
       <w:start w:val="1"/>
       <w:numFmt w:val="bullet"/>
       <w:lvlText w:val="●"/>
@@ -1009,7 +925,7 @@
         <w:ind w:left="5040" w:hanging="360"/>
       </w:pPr>
     </w:lvl>
-    <w:lvl w:ilvl="7" w15:tentative="1">
+    <w:lvl w:ilvl="7" w:tentative="1">
       <w:start w:val="1"/>
       <w:numFmt w:val="bullet"/>
       <w:lvlText w:val="●"/>
@@ -1018,7 +934,7 @@
         <w:ind w:left="5760" w:hanging="360"/>
       </w:pPr>
     </w:lvl>
-    <w:lvl w:ilvl="8" w15:tentative="1">
+    <w:lvl w:ilvl="8" w:tentative="1">
       <w:start w:val="1"/>
       <w:numFmt w:val="bullet"/>
       <w:lvlText w:val="●"/>
@@ -1040,14 +956,13 @@
 <file path=word/styles.xml><?xml version="1.0" encoding="utf-8"?>
 <w:styles xmlns:mc="http://schemas.openxmlformats.org/markup-compatibility/2006" xmlns:r="http://schemas.openxmlformats.org/officeDocument/2006/relationships" xmlns:w="http://schemas.openxmlformats.org/wordprocessingml/2006/main" xmlns:w14="http://schemas.microsoft.com/office/word/2010/wordml" xmlns:w15="http://schemas.microsoft.com/office/word/2012/wordml" mc:Ignorable="w14 w15">
   <w:docDefaults>
-    <w:rPrDefault>
-      <w:rPr>
-        <w:rFonts w:ascii="Calibri" w:cs="Calibri" w:eastAsia="Calibri" w:hAnsi="Calibri"/>
-        <w:color w:val="1F2933"/>
-      </w:rPr>
-    </w:rPrDefault>
+    <w:rPrDefault/>
     <w:pPrDefault/>
   </w:docDefaults>
+  <w:style w:type="paragraph" w:styleId="Normal" w:default="1">
+    <w:name w:val="Normal"/>
+    <w:qFormat/>
+  </w:style>
   <w:style w:type="paragraph" w:styleId="Title">
     <w:name w:val="Title"/>
     <w:basedOn w:val="Normal"/>
@@ -1220,4 +1135,294 @@
     </w:rPr>
   </w:style>
 </w:styles>
+</file>
+
+<file path=word/theme/theme1.xml><?xml version="1.0" encoding="utf-8"?>
+<a:theme xmlns:a="http://schemas.openxmlformats.org/drawingml/2006/main" name="Office Theme">
+  <a:themeElements>
+    <a:clrScheme name="Office">
+      <a:dk1>
+        <a:sysClr val="windowText" lastClr="000000"/>
+      </a:dk1>
+      <a:lt1>
+        <a:sysClr val="window" lastClr="FFFFFF"/>
+      </a:lt1>
+      <a:dk2>
+        <a:srgbClr val="44546A"/>
+      </a:dk2>
+      <a:lt2>
+        <a:srgbClr val="E7E6E6"/>
+      </a:lt2>
+      <a:accent1>
+        <a:srgbClr val="4472C4"/>
+      </a:accent1>
+      <a:accent2>
+        <a:srgbClr val="ED7D31"/>
+      </a:accent2>
+      <a:accent3>
+        <a:srgbClr val="A5A5A5"/>
+      </a:accent3>
+      <a:accent4>
+        <a:srgbClr val="FFC000"/>
+      </a:accent4>
+      <a:accent5>
+        <a:srgbClr val="5B9BD5"/>
+      </a:accent5>
+      <a:accent6>
+        <a:srgbClr val="70AD47"/>
+      </a:accent6>
+      <a:hlink>
+        <a:srgbClr val="0563C1"/>
+      </a:hlink>
+      <a:folHlink>
+        <a:srgbClr val="954F72"/>
+      </a:folHlink>
+    </a:clrScheme>
+    <a:fontScheme name="Office">
+      <a:majorFont>
+        <a:latin typeface="Calibri Light" panose="020F0302020204030204"/>
+        <a:ea typeface=""/>
+        <a:cs typeface=""/>
+        <a:font script="Jpan" typeface="游ゴシック Light"/>
+        <a:font script="Hang" typeface="맑은 고딕"/>
+        <a:font script="Hans" typeface="等线 Light"/>
+        <a:font script="Hant" typeface="新細明體"/>
+        <a:font script="Arab" typeface="Times New Roman"/>
+        <a:font script="Hebr" typeface="Times New Roman"/>
+        <a:font script="Thai" typeface="Angsana New"/>
+        <a:font script="Ethi" typeface="Nyala"/>
+        <a:font script="Beng" typeface="Vrinda"/>
+        <a:font script="Gujr" typeface="Shruti"/>
+        <a:font script="Khmr" typeface="MoolBoran"/>
+        <a:font script="Knda" typeface="Tunga"/>
+        <a:font script="Guru" typeface="Raavi"/>
+        <a:font script="Cans" typeface="Euphemia"/>
+        <a:font script="Cher" typeface="Plantagenet Cherokee"/>
+        <a:font script="Yiii" typeface="Microsoft Yi Baiti"/>
+        <a:font script="Tibt" typeface="Microsoft Himalaya"/>
+        <a:font script="Thaa" typeface="MV Boli"/>
+        <a:font script="Deva" typeface="Mangal"/>
+        <a:font script="Telu" typeface="Gautami"/>
+        <a:font script="Taml" typeface="Latha"/>
+        <a:font script="Syrc" typeface="Estrangelo Edessa"/>
+        <a:font script="Orya" typeface="Kalinga"/>
+        <a:font script="Mlym" typeface="Kartika"/>
+        <a:font script="Laoo" typeface="DokChampa"/>
+        <a:font script="Sinh" typeface="Iskoola Pota"/>
+        <a:font script="Mong" typeface="Mongolian Baiti"/>
+        <a:font script="Viet" typeface="Times New Roman"/>
+        <a:font script="Uigh" typeface="Microsoft Uighur"/>
+        <a:font script="Geor" typeface="Sylfaen"/>
+        <a:font script="Armn" typeface="Arial"/>
+        <a:font script="Bugi" typeface="Leelawadee UI"/>
+        <a:font script="Bopo" typeface="Microsoft JhengHei"/>
+        <a:font script="Java" typeface="Javanese Text"/>
+        <a:font script="Lisu" typeface="Segoe UI"/>
+        <a:font script="Mymr" typeface="Myanmar Text"/>
+        <a:font script="Nkoo" typeface="Ebrima"/>
+        <a:font script="Olck" typeface="Nirmala UI"/>
+        <a:font script="Osma" typeface="Ebrima"/>
+        <a:font script="Phag" typeface="Phagspa"/>
+        <a:font script="Syrn" typeface="Estrangelo Edessa"/>
+        <a:font script="Syrj" typeface="Estrangelo Edessa"/>
+        <a:font script="Syre" typeface="Estrangelo Edessa"/>
+        <a:font script="Sora" typeface="Nirmala UI"/>
+        <a:font script="Tale" typeface="Microsoft Tai Le"/>
+        <a:font script="Talu" typeface="Microsoft New Tai Lue"/>
+        <a:font script="Tfng" typeface="Ebrima"/>
+      </a:majorFont>
+      <a:minorFont>
+        <a:latin typeface="Calibri" panose="020F0502020204030204"/>
+        <a:ea typeface=""/>
+        <a:cs typeface=""/>
+        <a:font script="Jpan" typeface="游明朝"/>
+        <a:font script="Hang" typeface="맑은 고딕"/>
+        <a:font script="Hans" typeface="等线"/>
+        <a:font script="Hant" typeface="新細明體"/>
+        <a:font script="Arab" typeface="Arial"/>
+        <a:font script="Hebr" typeface="Arial"/>
+        <a:font script="Thai" typeface="Cordia New"/>
+        <a:font script="Ethi" typeface="Nyala"/>
+        <a:font script="Beng" typeface="Vrinda"/>
+        <a:font script="Gujr" typeface="Shruti"/>
+        <a:font script="Khmr" typeface="DaunPenh"/>
+        <a:font script="Knda" typeface="Tunga"/>
+        <a:font script="Guru" typeface="Raavi"/>
+        <a:font script="Cans" typeface="Euphemia"/>
+        <a:font script="Cher" typeface="Plantagenet Cherokee"/>
+        <a:font script="Yiii" typeface="Microsoft Yi Baiti"/>
+        <a:font script="Tibt" typeface="Microsoft Himalaya"/>
+        <a:font script="Thaa" typeface="MV Boli"/>
+        <a:font script="Deva" typeface="Mangal"/>
+        <a:font script="Telu" typeface="Gautami"/>
+        <a:font script="Taml" typeface="Latha"/>
+        <a:font script="Syrc" typeface="Estrangelo Edessa"/>
+        <a:font script="Orya" typeface="Kalinga"/>
+        <a:font script="Mlym" typeface="Kartika"/>
+        <a:font script="Laoo" typeface="DokChampa"/>
+        <a:font script="Sinh" typeface="Iskoola Pota"/>
+        <a:font script="Mong" typeface="Mongolian Baiti"/>
+        <a:font script="Viet" typeface="Arial"/>
+        <a:font script="Uigh" typeface="Microsoft Uighur"/>
+        <a:font script="Geor" typeface="Sylfaen"/>
+        <a:font script="Armn" typeface="Arial"/>
+        <a:font script="Bugi" typeface="Leelawadee UI"/>
+        <a:font script="Bopo" typeface="Microsoft JhengHei"/>
+        <a:font script="Java" typeface="Javanese Text"/>
+        <a:font script="Lisu" typeface="Segoe UI"/>
+        <a:font script="Mymr" typeface="Myanmar Text"/>
+        <a:font script="Nkoo" typeface="Ebrima"/>
+        <a:font script="Olck" typeface="Nirmala UI"/>
+        <a:font script="Osma" typeface="Ebrima"/>
+        <a:font script="Phag" typeface="Phagspa"/>
+        <a:font script="Syrn" typeface="Estrangelo Edessa"/>
+        <a:font script="Syrj" typeface="Estrangelo Edessa"/>
+        <a:font script="Syre" typeface="Estrangelo Edessa"/>
+        <a:font script="Sora" typeface="Nirmala UI"/>
+        <a:font script="Tale" typeface="Microsoft Tai Le"/>
+        <a:font script="Talu" typeface="Microsoft New Tai Lue"/>
+        <a:font script="Tfng" typeface="Ebrima"/>
+      </a:minorFont>
+    </a:fontScheme>
+    <a:fmtScheme name="Office">
+      <a:fillStyleLst>
+        <a:solidFill>
+          <a:schemeClr val="phClr"/>
+        </a:solidFill>
+        <a:gradFill rotWithShape="true">
+          <a:gsLst>
+            <a:gs pos="0">
+              <a:schemeClr val="phClr">
+                <a:lumMod val="110000"/>
+                <a:satMod val="105000"/>
+                <a:tint val="67000"/>
+              </a:schemeClr>
+            </a:gs>
+            <a:gs pos="50000">
+              <a:schemeClr val="phClr">
+                <a:lumMod val="105000"/>
+                <a:satMod val="103000"/>
+                <a:tint val="73000"/>
+              </a:schemeClr>
+            </a:gs>
+            <a:gs pos="100000">
+              <a:schemeClr val="phClr">
+                <a:lumMod val="105000"/>
+                <a:satMod val="109000"/>
+                <a:tint val="81000"/>
+              </a:schemeClr>
+            </a:gs>
+          </a:gsLst>
+          <a:lin ang="5400000" scaled="false"/>
+        </a:gradFill>
+        <a:gradFill rotWithShape="true">
+          <a:gsLst>
+            <a:gs pos="0">
+              <a:schemeClr val="phClr">
+                <a:satMod val="103000"/>
+                <a:lumMod val="102000"/>
+                <a:tint val="94000"/>
+              </a:schemeClr>
+            </a:gs>
+            <a:gs pos="50000">
+              <a:schemeClr val="phClr">
+                <a:satMod val="110000"/>
+                <a:lumMod val="100000"/>
+                <a:shade val="100000"/>
+              </a:schemeClr>
+            </a:gs>
+            <a:gs pos="100000">
+              <a:schemeClr val="phClr">
+                <a:lumMod val="99000"/>
+                <a:satMod val="120000"/>
+                <a:shade val="78000"/>
+              </a:schemeClr>
+            </a:gs>
+          </a:gsLst>
+          <a:lin ang="5400000" scaled="false"/>
+        </a:gradFill>
+      </a:fillStyleLst>
+      <a:lnStyleLst>
+        <a:ln w="6350" cap="flat" cmpd="sng" algn="ctr">
+          <a:solidFill>
+            <a:schemeClr val="phClr"/>
+          </a:solidFill>
+          <a:prstDash val="solid"/>
+          <a:miter lim="800000"/>
+        </a:ln>
+        <a:ln w="12700" cap="flat" cmpd="sng" algn="ctr">
+          <a:solidFill>
+            <a:schemeClr val="phClr"/>
+          </a:solidFill>
+          <a:prstDash val="solid"/>
+          <a:miter lim="800000"/>
+        </a:ln>
+        <a:ln w="19050" cap="flat" cmpd="sng" algn="ctr">
+          <a:solidFill>
+            <a:schemeClr val="phClr"/>
+          </a:solidFill>
+          <a:prstDash val="solid"/>
+          <a:miter lim="800000"/>
+        </a:ln>
+      </a:lnStyleLst>
+      <a:effectStyleLst>
+        <a:effectStyle>
+          <a:effectLst/>
+        </a:effectStyle>
+        <a:effectStyle>
+          <a:effectLst/>
+        </a:effectStyle>
+        <a:effectStyle>
+          <a:effectLst>
+            <a:outerShdw blurRad="57150" dist="19050" dir="5400000" algn="ctr" rotWithShape="false">
+              <a:srgbClr val="000000">
+                <a:alpha val="63000"/>
+              </a:srgbClr>
+            </a:outerShdw>
+          </a:effectLst>
+        </a:effectStyle>
+      </a:effectStyleLst>
+      <a:bgFillStyleLst>
+        <a:solidFill>
+          <a:schemeClr val="phClr"/>
+        </a:solidFill>
+        <a:solidFill>
+          <a:schemeClr val="phClr">
+            <a:tint val="95000"/>
+            <a:satMod val="170000"/>
+          </a:schemeClr>
+        </a:solidFill>
+        <a:gradFill rotWithShape="true">
+          <a:gsLst>
+            <a:gs pos="0">
+              <a:schemeClr val="phClr">
+                <a:tint val="93000"/>
+                <a:satMod val="150000"/>
+                <a:shade val="98000"/>
+                <a:lumMod val="102000"/>
+              </a:schemeClr>
+            </a:gs>
+            <a:gs pos="50000">
+              <a:schemeClr val="phClr">
+                <a:tint val="98000"/>
+                <a:satMod val="130000"/>
+                <a:shade val="90000"/>
+                <a:lumMod val="103000"/>
+              </a:schemeClr>
+            </a:gs>
+            <a:gs pos="100000">
+              <a:schemeClr val="phClr">
+                <a:shade val="63000"/>
+                <a:satMod val="120000"/>
+              </a:schemeClr>
+            </a:gs>
+          </a:gsLst>
+          <a:lin ang="5400000" scaled="false"/>
+        </a:gradFill>
+      </a:bgFillStyleLst>
+    </a:fmtScheme>
+  </a:themeElements>
+  <a:objectDefaults/>
+  <a:extraClrSchemeLst/>
+</a:theme>
 </file>
</xml_diff>